<commit_message>
DOCS : Modifs cas 1 projet 1
</commit_message>
<xml_diff>
--- a/Cas 1 Projet 1.docx
+++ b/Cas 1 Projet 1.docx
@@ -49,7 +49,13 @@
         <w:ind w:firstLine="708"/>
       </w:pPr>
       <w:r>
-        <w:t>[Hugo Victor, Les Misérables],</w:t>
+        <w:t>[Antoine de Saint-Exupéry,</w:t>
+      </w:r>
+      <w:r>
+        <w:t xml:space="preserve"> </w:t>
+      </w:r>
+      <w:r>
+        <w:t>Le petit prince],</w:t>
       </w:r>
     </w:p>
     <w:p>
@@ -57,10 +63,15 @@
         <w:ind w:firstLine="708"/>
       </w:pPr>
       <w:r>
-        <w:t>[Marti</w:t>
-      </w:r>
-      <w:r>
-        <w:t>n Georges R.R, Le Trône de fer],</w:t>
+        <w:t>[</w:t>
+      </w:r>
+      <w:proofErr w:type="spellStart"/>
+      <w:r>
+        <w:t>Cormac</w:t>
+      </w:r>
+      <w:proofErr w:type="spellEnd"/>
+      <w:r>
+        <w:t xml:space="preserve"> McCarthy, Blood Meridian],</w:t>
       </w:r>
     </w:p>
     <w:p>
@@ -68,7 +79,7 @@
         <w:ind w:firstLine="708"/>
       </w:pPr>
       <w:r>
-        <w:t>[Stoker Bram, Dracula]</w:t>
+        <w:t>[Frank Anne, Le journal d’Anne Frank]</w:t>
       </w:r>
       <w:r>
         <w:t>,</w:t>
@@ -79,18 +90,7 @@
         <w:ind w:firstLine="708"/>
       </w:pPr>
       <w:r>
-        <w:t>[</w:t>
-      </w:r>
-      <w:proofErr w:type="spellStart"/>
-      <w:r>
-        <w:t>Cormac</w:t>
-      </w:r>
-      <w:proofErr w:type="spellEnd"/>
-      <w:r>
-        <w:t xml:space="preserve"> McCarthy, Blood Meridian]</w:t>
-      </w:r>
-      <w:r>
-        <w:t>,</w:t>
+        <w:t>[Hugo Victor, Les Misérables],</w:t>
       </w:r>
     </w:p>
     <w:p>
@@ -98,22 +98,10 @@
         <w:ind w:firstLine="708"/>
       </w:pPr>
       <w:r>
-        <w:t>[Antoine de Saint-Exupéry</w:t>
-      </w:r>
-      <w:r>
-        <w:t>,</w:t>
-      </w:r>
-      <w:r>
-        <w:t xml:space="preserve"> </w:t>
-      </w:r>
-      <w:r>
-        <w:t>Le petit prince</w:t>
-      </w:r>
-      <w:r>
-        <w:t>]</w:t>
-      </w:r>
-      <w:r>
-        <w:t>,</w:t>
+        <w:t>[Marti</w:t>
+      </w:r>
+      <w:r>
+        <w:t>n Georges R.R, Le Trône de fer],</w:t>
       </w:r>
     </w:p>
     <w:p>
@@ -121,22 +109,16 @@
         <w:ind w:firstLine="708"/>
       </w:pPr>
       <w:r>
-        <w:t>[</w:t>
-      </w:r>
-      <w:r>
-        <w:t>Anne Frank, Le journal d’Anne Frank</w:t>
-      </w:r>
+        <w:t>[Stoker Bram, Dracula]</w:t>
+      </w:r>
+    </w:p>
+    <w:p>
       <w:r>
         <w:t>]</w:t>
       </w:r>
     </w:p>
     <w:p>
       <w:r>
-        <w:t>]</w:t>
-      </w:r>
-    </w:p>
-    <w:p>
-      <w:r>
         <w:t>DEMANDER livre</w:t>
       </w:r>
     </w:p>
@@ -164,10 +146,18 @@
     </w:p>
     <w:p>
       <w:r>
-        <w:t xml:space="preserve">POUR </w:t>
-      </w:r>
-      <w:r>
-        <w:t>i de 0 à taille stock – 1</w:t>
+        <w:t xml:space="preserve">POUR i de 0 à taille </w:t>
+      </w:r>
+      <w:proofErr w:type="spellStart"/>
+      <w:r>
+        <w:t>stock</w:t>
+      </w:r>
+      <w:r>
+        <w:t>Livres</w:t>
+      </w:r>
+      <w:proofErr w:type="spellEnd"/>
+      <w:r>
+        <w:t xml:space="preserve"> – 1</w:t>
       </w:r>
     </w:p>
     <w:p>
@@ -175,7 +165,21 @@
         <w:ind w:firstLine="708"/>
       </w:pPr>
       <w:r>
-        <w:t>SI commande = stock[i]</w:t>
+        <w:t>SI livre</w:t>
+      </w:r>
+      <w:r>
+        <w:t xml:space="preserve"> = </w:t>
+      </w:r>
+      <w:proofErr w:type="spellStart"/>
+      <w:r>
+        <w:t>stock</w:t>
+      </w:r>
+      <w:r>
+        <w:t>Livres</w:t>
+      </w:r>
+      <w:proofErr w:type="spellEnd"/>
+      <w:r>
+        <w:t>[i]</w:t>
       </w:r>
     </w:p>
     <w:p>
@@ -330,13 +334,100 @@
         <w:t>[0] !</w:t>
       </w:r>
       <w:r>
-        <w:t xml:space="preserve">= </w:t>
+        <w:t>= livre</w:t>
+      </w:r>
+    </w:p>
+    <w:p>
+      <w:r>
+        <w:t xml:space="preserve">Livre non </w:t>
+      </w:r>
+      <w:proofErr w:type="gramStart"/>
+      <w:r>
+        <w:t>trouvé</w:t>
+      </w:r>
+      <w:proofErr w:type="gramEnd"/>
+    </w:p>
+    <w:p>
+      <w:proofErr w:type="gramStart"/>
+      <w:r>
+        <w:rPr>
+          <w:b/>
+        </w:rPr>
+        <w:t>i</w:t>
+      </w:r>
+      <w:proofErr w:type="gramEnd"/>
+      <w:r>
+        <w:rPr>
+          <w:b/>
+        </w:rPr>
+        <w:t xml:space="preserve"> = 1 </w:t>
+      </w:r>
+      <w:r>
+        <w:t xml:space="preserve"> -&gt; </w:t>
       </w:r>
       <w:proofErr w:type="spellStart"/>
       <w:r>
-        <w:t>livreCommande</w:t>
+        <w:t>stockLivres</w:t>
       </w:r>
       <w:proofErr w:type="spellEnd"/>
+      <w:r>
+        <w:t>[1]</w:t>
+      </w:r>
+      <w:r>
+        <w:t> !</w:t>
+      </w:r>
+      <w:r>
+        <w:t>= livre</w:t>
+      </w:r>
+    </w:p>
+    <w:p>
+      <w:r>
+        <w:t xml:space="preserve">Livre </w:t>
+      </w:r>
+      <w:r>
+        <w:t xml:space="preserve">non </w:t>
+      </w:r>
+      <w:proofErr w:type="gramStart"/>
+      <w:r>
+        <w:t>trouvé</w:t>
+      </w:r>
+      <w:proofErr w:type="gramEnd"/>
+    </w:p>
+    <w:p>
+      <w:proofErr w:type="gramStart"/>
+      <w:r>
+        <w:rPr>
+          <w:b/>
+        </w:rPr>
+        <w:t>i</w:t>
+      </w:r>
+      <w:proofErr w:type="gramEnd"/>
+      <w:r>
+        <w:rPr>
+          <w:b/>
+        </w:rPr>
+        <w:t xml:space="preserve"> = 2</w:t>
+      </w:r>
+      <w:r>
+        <w:rPr>
+          <w:b/>
+        </w:rPr>
+        <w:t xml:space="preserve"> </w:t>
+      </w:r>
+      <w:r>
+        <w:t xml:space="preserve">-&gt; </w:t>
+      </w:r>
+      <w:proofErr w:type="spellStart"/>
+      <w:r>
+        <w:t>stockLivres</w:t>
+      </w:r>
+      <w:proofErr w:type="spellEnd"/>
+      <w:r>
+        <w:t>[2</w:t>
+      </w:r>
+      <w:r>
+        <w:t>] != livre</w:t>
+      </w:r>
     </w:p>
     <w:p>
       <w:r>
@@ -361,79 +452,335 @@
         <w:rPr>
           <w:b/>
         </w:rPr>
+        <w:t xml:space="preserve"> = 3</w:t>
+      </w:r>
+      <w:r>
+        <w:rPr>
+          <w:b/>
+        </w:rPr>
+        <w:t xml:space="preserve"> </w:t>
+      </w:r>
+      <w:r>
+        <w:t xml:space="preserve"> -&gt; </w:t>
+      </w:r>
+      <w:proofErr w:type="spellStart"/>
+      <w:r>
+        <w:t>stockLivres</w:t>
+      </w:r>
+      <w:proofErr w:type="spellEnd"/>
+      <w:r>
+        <w:t>[3</w:t>
+      </w:r>
+      <w:r>
+        <w:t>]</w:t>
+      </w:r>
+      <w:r>
+        <w:t> !</w:t>
+      </w:r>
+      <w:r>
+        <w:t>= livre</w:t>
+      </w:r>
+    </w:p>
+    <w:p>
+      <w:r>
+        <w:t xml:space="preserve">Livre non </w:t>
+      </w:r>
+      <w:proofErr w:type="gramStart"/>
+      <w:r>
+        <w:t>trouvé</w:t>
+      </w:r>
+      <w:proofErr w:type="gramEnd"/>
+    </w:p>
+    <w:p>
+      <w:proofErr w:type="gramStart"/>
+      <w:r>
+        <w:rPr>
+          <w:b/>
+        </w:rPr>
+        <w:t>i</w:t>
+      </w:r>
+      <w:proofErr w:type="gramEnd"/>
+      <w:r>
+        <w:rPr>
+          <w:b/>
+        </w:rPr>
+        <w:t xml:space="preserve"> = 4</w:t>
+      </w:r>
+      <w:r>
+        <w:rPr>
+          <w:b/>
+        </w:rPr>
+        <w:t xml:space="preserve"> </w:t>
+      </w:r>
+      <w:r>
+        <w:t xml:space="preserve">-&gt; </w:t>
+      </w:r>
+      <w:proofErr w:type="spellStart"/>
+      <w:r>
+        <w:t>stockLivres</w:t>
+      </w:r>
+      <w:proofErr w:type="spellEnd"/>
+      <w:r>
+        <w:t>[4</w:t>
+      </w:r>
+      <w:r>
+        <w:t>] </w:t>
+      </w:r>
+      <w:r>
+        <w:t>= livre</w:t>
+      </w:r>
+    </w:p>
+    <w:p>
+      <w:r>
+        <w:t>Livre trouvé</w:t>
+      </w:r>
+    </w:p>
+    <w:p>
+      <w:pPr>
+        <w:rPr>
+          <w:b/>
+        </w:rPr>
+      </w:pPr>
+    </w:p>
+    <w:p>
+      <w:pPr>
+        <w:rPr>
+          <w:b/>
+        </w:rPr>
+      </w:pPr>
+      <w:r>
+        <w:rPr>
+          <w:b/>
+        </w:rPr>
+        <w:t>TRACAGE</w:t>
+      </w:r>
+      <w:r>
+        <w:rPr>
+          <w:b/>
+        </w:rPr>
+        <w:t xml:space="preserve"> (Stephen King, Carrie (N’est pas dans le stock))</w:t>
+      </w:r>
+    </w:p>
+    <w:p>
+      <w:pPr>
+        <w:rPr>
+          <w:b/>
+        </w:rPr>
+      </w:pPr>
+      <w:r>
+        <w:rPr>
+          <w:b/>
+        </w:rPr>
+        <w:t xml:space="preserve">Passage 1 </w:t>
+      </w:r>
+    </w:p>
+    <w:p>
+      <w:proofErr w:type="gramStart"/>
+      <w:r>
+        <w:rPr>
+          <w:b/>
+        </w:rPr>
+        <w:t>i</w:t>
+      </w:r>
+      <w:proofErr w:type="gramEnd"/>
+      <w:r>
+        <w:rPr>
+          <w:b/>
+        </w:rPr>
+        <w:t xml:space="preserve"> = 0 </w:t>
+      </w:r>
+      <w:r>
+        <w:t>-&gt;</w:t>
+      </w:r>
+      <w:r>
+        <w:t xml:space="preserve"> </w:t>
+      </w:r>
+      <w:proofErr w:type="spellStart"/>
+      <w:r>
+        <w:t>stockLivres</w:t>
+      </w:r>
+      <w:proofErr w:type="spellEnd"/>
+      <w:r>
+        <w:t>[0] != livre</w:t>
+      </w:r>
+    </w:p>
+    <w:p>
+      <w:r>
+        <w:t xml:space="preserve">Livre non </w:t>
+      </w:r>
+      <w:proofErr w:type="gramStart"/>
+      <w:r>
+        <w:t>trouvé</w:t>
+      </w:r>
+      <w:proofErr w:type="gramEnd"/>
+    </w:p>
+    <w:p>
+      <w:proofErr w:type="gramStart"/>
+      <w:r>
+        <w:rPr>
+          <w:b/>
+        </w:rPr>
+        <w:t>i</w:t>
+      </w:r>
+      <w:proofErr w:type="gramEnd"/>
+      <w:r>
+        <w:rPr>
+          <w:b/>
+        </w:rPr>
         <w:t xml:space="preserve"> = 1 </w:t>
       </w:r>
       <w:r>
+        <w:t xml:space="preserve"> -&gt;</w:t>
+      </w:r>
+      <w:r>
+        <w:t xml:space="preserve"> </w:t>
+      </w:r>
+      <w:proofErr w:type="spellStart"/>
+      <w:r>
+        <w:t>stockLivres</w:t>
+      </w:r>
+      <w:proofErr w:type="spellEnd"/>
+      <w:r>
+        <w:t>[1] != livre</w:t>
+      </w:r>
+    </w:p>
+    <w:p>
+      <w:r>
+        <w:t xml:space="preserve">Livre non </w:t>
+      </w:r>
+      <w:proofErr w:type="gramStart"/>
+      <w:r>
+        <w:t>trouvé</w:t>
+      </w:r>
+      <w:proofErr w:type="gramEnd"/>
+    </w:p>
+    <w:p>
+      <w:proofErr w:type="gramStart"/>
+      <w:r>
+        <w:rPr>
+          <w:b/>
+        </w:rPr>
+        <w:t>i</w:t>
+      </w:r>
+      <w:proofErr w:type="gramEnd"/>
+      <w:r>
+        <w:rPr>
+          <w:b/>
+        </w:rPr>
+        <w:t xml:space="preserve"> = 2 </w:t>
+      </w:r>
+      <w:r>
+        <w:t xml:space="preserve"> -&gt;</w:t>
+      </w:r>
+      <w:r>
+        <w:t xml:space="preserve"> </w:t>
+      </w:r>
+      <w:proofErr w:type="spellStart"/>
+      <w:r>
+        <w:t>stockLivres</w:t>
+      </w:r>
+      <w:proofErr w:type="spellEnd"/>
+      <w:r>
+        <w:t>[2] != livre</w:t>
+      </w:r>
+    </w:p>
+    <w:p>
+      <w:r>
+        <w:t xml:space="preserve">Livre non </w:t>
+      </w:r>
+      <w:proofErr w:type="gramStart"/>
+      <w:r>
+        <w:t>trouvé</w:t>
+      </w:r>
+      <w:proofErr w:type="gramEnd"/>
+    </w:p>
+    <w:p>
+      <w:proofErr w:type="gramStart"/>
+      <w:r>
+        <w:rPr>
+          <w:b/>
+        </w:rPr>
+        <w:t>i</w:t>
+      </w:r>
+      <w:proofErr w:type="gramEnd"/>
+      <w:r>
+        <w:rPr>
+          <w:b/>
+        </w:rPr>
+        <w:t xml:space="preserve"> = 3 </w:t>
+      </w:r>
+      <w:r>
         <w:t xml:space="preserve"> -&gt; </w:t>
       </w:r>
       <w:proofErr w:type="spellStart"/>
       <w:r>
+        <w:t>stockLivr</w:t>
+      </w:r>
+      <w:r>
+        <w:t>es</w:t>
+      </w:r>
+      <w:proofErr w:type="spellEnd"/>
+      <w:r>
+        <w:t>[3]</w:t>
+      </w:r>
+      <w:r>
+        <w:t> !</w:t>
+      </w:r>
+      <w:r>
+        <w:t>= livre</w:t>
+      </w:r>
+    </w:p>
+    <w:p>
+      <w:r>
+        <w:t xml:space="preserve">Livre non </w:t>
+      </w:r>
+      <w:proofErr w:type="gramStart"/>
+      <w:r>
+        <w:t>trouvé</w:t>
+      </w:r>
+      <w:proofErr w:type="gramEnd"/>
+    </w:p>
+    <w:p>
+      <w:proofErr w:type="gramStart"/>
+      <w:r>
+        <w:rPr>
+          <w:b/>
+        </w:rPr>
+        <w:t>i</w:t>
+      </w:r>
+      <w:proofErr w:type="gramEnd"/>
+      <w:r>
+        <w:rPr>
+          <w:b/>
+        </w:rPr>
+        <w:t xml:space="preserve"> = 4 </w:t>
+      </w:r>
+      <w:r>
+        <w:t xml:space="preserve">-&gt; </w:t>
+      </w:r>
+      <w:proofErr w:type="spellStart"/>
+      <w:r>
         <w:t>stockLivres</w:t>
       </w:r>
       <w:proofErr w:type="spellEnd"/>
       <w:r>
-        <w:t>[1] </w:t>
-      </w:r>
-      <w:r>
-        <w:t xml:space="preserve">= </w:t>
-      </w:r>
-      <w:proofErr w:type="spellStart"/>
-      <w:r>
-        <w:t>livreCommande</w:t>
-      </w:r>
-      <w:proofErr w:type="spellEnd"/>
-    </w:p>
-    <w:p>
-      <w:r>
-        <w:t>Livre trouvé !</w:t>
-      </w:r>
-    </w:p>
-    <w:p>
-      <w:pPr>
-        <w:rPr>
-          <w:b/>
-        </w:rPr>
-      </w:pPr>
-    </w:p>
-    <w:p>
-      <w:pPr>
-        <w:rPr>
-          <w:b/>
-        </w:rPr>
-      </w:pPr>
+        <w:t>[4</w:t>
+      </w:r>
+      <w:r>
+        <w:t>] != livre</w:t>
+      </w:r>
       <w:bookmarkStart w:id="0" w:name="_GoBack"/>
       <w:bookmarkEnd w:id="0"/>
-      <w:r>
-        <w:rPr>
-          <w:b/>
-        </w:rPr>
-        <w:t>TRACAGE</w:t>
-      </w:r>
-      <w:r>
-        <w:rPr>
-          <w:b/>
-        </w:rPr>
-        <w:t xml:space="preserve"> (Stephen King, Carrie (N’est pas dans le stock)</w:t>
-      </w:r>
-      <w:r>
-        <w:rPr>
-          <w:b/>
-        </w:rPr>
-        <w:t>)</w:t>
-      </w:r>
-    </w:p>
-    <w:p>
-      <w:pPr>
-        <w:rPr>
-          <w:b/>
-        </w:rPr>
-      </w:pPr>
-      <w:r>
-        <w:rPr>
-          <w:b/>
-        </w:rPr>
-        <w:t xml:space="preserve">Passage 1 </w:t>
-      </w:r>
+    </w:p>
+    <w:p>
+      <w:r>
+        <w:t xml:space="preserve">Livre non </w:t>
+      </w:r>
+      <w:proofErr w:type="gramStart"/>
+      <w:r>
+        <w:t>trouvé</w:t>
+      </w:r>
+      <w:proofErr w:type="gramEnd"/>
     </w:p>
     <w:p>
       <w:proofErr w:type="gramStart"/>
@@ -448,10 +795,10 @@
         <w:rPr>
           <w:b/>
         </w:rPr>
-        <w:t xml:space="preserve"> = 0 </w:t>
-      </w:r>
-      <w:r>
-        <w:t xml:space="preserve">-&gt; </w:t>
+        <w:t xml:space="preserve"> = 5 </w:t>
+      </w:r>
+      <w:r>
+        <w:t xml:space="preserve"> -&gt; </w:t>
       </w:r>
       <w:proofErr w:type="spellStart"/>
       <w:r>
@@ -459,278 +806,51 @@
       </w:r>
       <w:proofErr w:type="spellEnd"/>
       <w:r>
-        <w:t xml:space="preserve">[0] != </w:t>
+        <w:t>[5</w:t>
+      </w:r>
+      <w:r>
+        <w:t>] != livre</w:t>
+      </w:r>
+    </w:p>
+    <w:p>
+      <w:r>
+        <w:t xml:space="preserve">Livre non </w:t>
+      </w:r>
+      <w:proofErr w:type="gramStart"/>
+      <w:r>
+        <w:t>trouvé</w:t>
+      </w:r>
+      <w:proofErr w:type="gramEnd"/>
+    </w:p>
+    <w:p>
+      <w:proofErr w:type="gramStart"/>
+      <w:r>
+        <w:rPr>
+          <w:b/>
+        </w:rPr>
+        <w:t>i</w:t>
+      </w:r>
+      <w:proofErr w:type="gramEnd"/>
+      <w:r>
+        <w:rPr>
+          <w:b/>
+        </w:rPr>
+        <w:t xml:space="preserve"> = 6 </w:t>
+      </w:r>
+      <w:r>
+        <w:t xml:space="preserve"> -&gt; </w:t>
       </w:r>
       <w:proofErr w:type="spellStart"/>
       <w:r>
-        <w:t>livreCommande</w:t>
+        <w:t>stockLivres</w:t>
       </w:r>
       <w:proofErr w:type="spellEnd"/>
-    </w:p>
-    <w:p>
-      <w:r>
-        <w:t xml:space="preserve">Livre non </w:t>
-      </w:r>
-      <w:proofErr w:type="gramStart"/>
-      <w:r>
-        <w:t>trouvé</w:t>
-      </w:r>
-      <w:proofErr w:type="gramEnd"/>
-    </w:p>
-    <w:p>
-      <w:proofErr w:type="gramStart"/>
-      <w:r>
-        <w:rPr>
-          <w:b/>
-        </w:rPr>
-        <w:t>i</w:t>
-      </w:r>
-      <w:proofErr w:type="gramEnd"/>
-      <w:r>
-        <w:rPr>
-          <w:b/>
-        </w:rPr>
-        <w:t xml:space="preserve"> = 1 </w:t>
-      </w:r>
-      <w:r>
-        <w:t xml:space="preserve"> -&gt; </w:t>
-      </w:r>
-      <w:proofErr w:type="spellStart"/>
-      <w:r>
-        <w:t>stockLivres</w:t>
-      </w:r>
-      <w:proofErr w:type="spellEnd"/>
-      <w:r>
-        <w:t xml:space="preserve">[1] != </w:t>
-      </w:r>
-      <w:proofErr w:type="spellStart"/>
-      <w:r>
-        <w:t>livreCommande</w:t>
-      </w:r>
-      <w:proofErr w:type="spellEnd"/>
-    </w:p>
-    <w:p>
-      <w:r>
-        <w:t xml:space="preserve">Livre non </w:t>
-      </w:r>
-      <w:proofErr w:type="gramStart"/>
-      <w:r>
-        <w:t>trouvé</w:t>
-      </w:r>
-      <w:proofErr w:type="gramEnd"/>
-    </w:p>
-    <w:p>
-      <w:proofErr w:type="gramStart"/>
-      <w:r>
-        <w:rPr>
-          <w:b/>
-        </w:rPr>
-        <w:t>i</w:t>
-      </w:r>
-      <w:proofErr w:type="gramEnd"/>
-      <w:r>
-        <w:rPr>
-          <w:b/>
-        </w:rPr>
-        <w:t xml:space="preserve"> = 2 </w:t>
-      </w:r>
-      <w:r>
-        <w:t xml:space="preserve"> -&gt; </w:t>
-      </w:r>
-      <w:proofErr w:type="spellStart"/>
-      <w:r>
-        <w:t>stockLivres</w:t>
-      </w:r>
-      <w:proofErr w:type="spellEnd"/>
-      <w:r>
-        <w:t xml:space="preserve">[2] != </w:t>
-      </w:r>
-      <w:proofErr w:type="spellStart"/>
-      <w:r>
-        <w:t>livreCommande</w:t>
-      </w:r>
-      <w:proofErr w:type="spellEnd"/>
-    </w:p>
-    <w:p>
-      <w:r>
-        <w:t xml:space="preserve">Livre non </w:t>
-      </w:r>
-      <w:proofErr w:type="gramStart"/>
-      <w:r>
-        <w:t>trouvé</w:t>
-      </w:r>
-      <w:proofErr w:type="gramEnd"/>
-    </w:p>
-    <w:p>
-      <w:proofErr w:type="gramStart"/>
-      <w:r>
-        <w:rPr>
-          <w:b/>
-        </w:rPr>
-        <w:t>i</w:t>
-      </w:r>
-      <w:proofErr w:type="gramEnd"/>
-      <w:r>
-        <w:rPr>
-          <w:b/>
-        </w:rPr>
-        <w:t xml:space="preserve"> = 3 </w:t>
-      </w:r>
-      <w:r>
-        <w:t xml:space="preserve"> -&gt; </w:t>
-      </w:r>
-      <w:proofErr w:type="spellStart"/>
-      <w:r>
-        <w:t>stockLivres</w:t>
-      </w:r>
-      <w:proofErr w:type="spellEnd"/>
-      <w:r>
-        <w:t xml:space="preserve">[3] = </w:t>
-      </w:r>
-      <w:proofErr w:type="spellStart"/>
-      <w:r>
-        <w:t>livreCommande</w:t>
-      </w:r>
-      <w:proofErr w:type="spellEnd"/>
-    </w:p>
-    <w:p>
-      <w:r>
-        <w:t>Livre trouvé !</w:t>
-      </w:r>
-    </w:p>
-    <w:p>
-      <w:proofErr w:type="gramStart"/>
-      <w:r>
-        <w:rPr>
-          <w:b/>
-        </w:rPr>
-        <w:t>i</w:t>
-      </w:r>
-      <w:proofErr w:type="gramEnd"/>
-      <w:r>
-        <w:rPr>
-          <w:b/>
-        </w:rPr>
-        <w:t xml:space="preserve"> = 4</w:t>
-      </w:r>
-      <w:r>
-        <w:rPr>
-          <w:b/>
-        </w:rPr>
-        <w:t xml:space="preserve"> </w:t>
-      </w:r>
-      <w:r>
-        <w:t xml:space="preserve">-&gt; </w:t>
-      </w:r>
-      <w:proofErr w:type="spellStart"/>
-      <w:r>
-        <w:t>stockLivres</w:t>
-      </w:r>
-      <w:proofErr w:type="spellEnd"/>
-      <w:r>
-        <w:t xml:space="preserve">[0] != </w:t>
-      </w:r>
-      <w:proofErr w:type="spellStart"/>
-      <w:r>
-        <w:t>livreCommande</w:t>
-      </w:r>
-      <w:proofErr w:type="spellEnd"/>
-    </w:p>
-    <w:p>
-      <w:r>
-        <w:t xml:space="preserve">Livre non </w:t>
-      </w:r>
-      <w:proofErr w:type="gramStart"/>
-      <w:r>
-        <w:t>trouvé</w:t>
-      </w:r>
-      <w:proofErr w:type="gramEnd"/>
-    </w:p>
-    <w:p>
-      <w:proofErr w:type="gramStart"/>
-      <w:r>
-        <w:rPr>
-          <w:b/>
-        </w:rPr>
-        <w:t>i</w:t>
-      </w:r>
-      <w:proofErr w:type="gramEnd"/>
-      <w:r>
-        <w:rPr>
-          <w:b/>
-        </w:rPr>
-        <w:t xml:space="preserve"> = 5</w:t>
-      </w:r>
-      <w:r>
-        <w:rPr>
-          <w:b/>
-        </w:rPr>
-        <w:t xml:space="preserve"> </w:t>
-      </w:r>
-      <w:r>
-        <w:t xml:space="preserve"> -&gt; </w:t>
-      </w:r>
-      <w:proofErr w:type="spellStart"/>
-      <w:r>
-        <w:t>stockLivres</w:t>
-      </w:r>
-      <w:proofErr w:type="spellEnd"/>
-      <w:r>
-        <w:t xml:space="preserve">[1] != </w:t>
-      </w:r>
-      <w:proofErr w:type="spellStart"/>
-      <w:r>
-        <w:t>livreCommande</w:t>
-      </w:r>
-      <w:proofErr w:type="spellEnd"/>
-    </w:p>
-    <w:p>
-      <w:r>
-        <w:t xml:space="preserve">Livre non </w:t>
-      </w:r>
-      <w:proofErr w:type="gramStart"/>
-      <w:r>
-        <w:t>trouvé</w:t>
-      </w:r>
-      <w:proofErr w:type="gramEnd"/>
-    </w:p>
-    <w:p>
-      <w:proofErr w:type="gramStart"/>
-      <w:r>
-        <w:rPr>
-          <w:b/>
-        </w:rPr>
-        <w:t>i</w:t>
-      </w:r>
-      <w:proofErr w:type="gramEnd"/>
-      <w:r>
-        <w:rPr>
-          <w:b/>
-        </w:rPr>
-        <w:t xml:space="preserve"> = 6</w:t>
-      </w:r>
-      <w:r>
-        <w:rPr>
-          <w:b/>
-        </w:rPr>
-        <w:t xml:space="preserve"> </w:t>
-      </w:r>
-      <w:r>
-        <w:t xml:space="preserve"> -&gt; </w:t>
-      </w:r>
-      <w:proofErr w:type="spellStart"/>
-      <w:r>
-        <w:t>stockLivres</w:t>
-      </w:r>
-      <w:proofErr w:type="spellEnd"/>
-      <w:r>
-        <w:t xml:space="preserve">[1] != </w:t>
-      </w:r>
-      <w:proofErr w:type="spellStart"/>
-      <w:r>
-        <w:t>livreCommande</w:t>
-      </w:r>
-      <w:proofErr w:type="spellEnd"/>
+      <w:r>
+        <w:t>[6</w:t>
+      </w:r>
+      <w:r>
+        <w:t>] != livre</w:t>
+      </w:r>
     </w:p>
     <w:p>
       <w:r>

</xml_diff>